<commit_message>
Auto commit (2026-10-13 17:22) — 5 changes
Claude Code 세션 종료 시 자동 커밋.

Co-Authored-By: Claude <noreply@anthropic.com>
Claude-Session: https://claude.ai/code/17806859-7bf9-459e-813e-ab1905e37167
</commit_message>
<xml_diff>
--- a/projects/리메이크 러프 기획안 top3_v2.docx
+++ b/projects/리메이크 러프 기획안 top3_v2.docx
@@ -69,7 +69,7 @@
           <w:color w:val="6B6B6B"/>
           <w:sz w:val="21"/>
         </w:rPr>
-        <w:t>01  41번 C안 엘프판  ·  The Little Girl Who Bought Her Own Dad</w:t>
+        <w:t>01  41번 C안 엘프판  ·  The Little Girl Who Hired Her Own Dad</w:t>
       </w:r>
     </w:p>
     <w:p>
@@ -187,7 +187,7 @@
           <w:color w:val="1F3A5F"/>
           <w:sz w:val="34"/>
         </w:rPr>
-        <w:t>[T1] The Little Girl Who Bought Her Own Dad</w:t>
+        <w:t>[T1] The Little Girl Who Hired Her Own Dad</w:t>
       </w:r>
     </w:p>
     <w:p>

</xml_diff>